<commit_message>
Remove week 0 samples from test data in classification model
</commit_message>
<xml_diff>
--- a/assignment/docs/S430452_Report.docx
+++ b/assignment/docs/S430452_Report.docx
@@ -3120,7 +3120,7 @@
           </mc:Choice>
           <mc:Fallback>
             <w:pict>
-              <v:group w14:anchorId="56729840" id="Group 16" o:spid="_x0000_s1026" style="position:absolute;margin-left:-14.25pt;margin-top:0;width:270.95pt;height:645.6pt;z-index:251669504" coordsize="34411,81991" o:gfxdata="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">
+              <v:group w14:anchorId="5E807C3B" id="Group 16" o:spid="_x0000_s1026" style="position:absolute;margin-left:-14.25pt;margin-top:0;width:270.95pt;height:645.6pt;z-index:251669504" coordsize="34411,81991" o:gfxdata="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">
                 <v:shapetype id="_x0000_t75" coordsize="21600,21600" o:spt="75" o:preferrelative="t" path="m@4@5l@4@11@9@11@9@5xe" filled="f" stroked="f">
                   <v:stroke joinstyle="miter"/>
                   <v:formulas>
@@ -3742,7 +3742,7 @@
           </mc:Choice>
           <mc:Fallback>
             <w:pict>
-              <v:group w14:anchorId="08D9486C" id="Group 20" o:spid="_x0000_s1026" style="position:absolute;margin-left:41.95pt;margin-top:34.3pt;width:393.15pt;height:557.75pt;z-index:251682816;mso-width-relative:margin;mso-height-relative:margin" coordorigin=",2677" coordsize="26993,44012" o:gfxdata="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">
+              <v:group w14:anchorId="1CD337BB" id="Group 20" o:spid="_x0000_s1026" style="position:absolute;margin-left:41.95pt;margin-top:34.3pt;width:393.15pt;height:557.75pt;z-index:251682816;mso-width-relative:margin;mso-height-relative:margin" coordorigin=",2677" coordsize="26993,44012" o:gfxdata="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">
                 <v:shape id="Picture 18" o:spid="_x0000_s1027" type="#_x0000_t75" alt="A graph with red and blue dots&#10;&#10;AI-generated content may be incorrect." style="position:absolute;top:25093;width:26993;height:21596;visibility:visible;mso-wrap-style:square" o:gfxdata="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">
                   <v:imagedata r:id="rId20" o:title="A graph with red and blue dots&#10;&#10;AI-generated content may be incorrect"/>
                 </v:shape>
@@ -6547,7 +6547,7 @@
               <w:t>0.</w:t>
             </w:r>
             <w:r>
-              <w:t>484</w:t>
+              <w:t>270</w:t>
             </w:r>
           </w:p>
         </w:tc>
@@ -6568,7 +6568,7 @@
               <w:t>0.</w:t>
             </w:r>
             <w:r>
-              <w:t>349</w:t>
+              <w:t>027</w:t>
             </w:r>
           </w:p>
         </w:tc>
@@ -6591,10 +6591,10 @@
           <w14:ligatures w14:val="standardContextual"/>
         </w:rPr>
         <w:drawing>
-          <wp:inline distT="0" distB="0" distL="0" distR="0" wp14:anchorId="666A1F65" wp14:editId="537FA535">
-            <wp:extent cx="5734800" cy="4093654"/>
-            <wp:effectExtent l="12700" t="12700" r="18415" b="8890"/>
-            <wp:docPr id="472660078" name="Picture 5" descr="A graph of a diagram&#10;&#10;AI-generated content may be incorrect."/>
+          <wp:inline distT="0" distB="0" distL="0" distR="0" wp14:anchorId="0DF6B6A5" wp14:editId="3AF3B077">
+            <wp:extent cx="5731510" cy="4043680"/>
+            <wp:effectExtent l="12700" t="12700" r="8890" b="7620"/>
+            <wp:docPr id="1836487775" name="Picture 21" descr="A screenshot of a graph&#10;&#10;AI-generated content may be incorrect."/>
             <wp:cNvGraphicFramePr>
               <a:graphicFrameLocks xmlns:a="http://schemas.openxmlformats.org/drawingml/2006/main" noChangeAspect="1"/>
             </wp:cNvGraphicFramePr>
@@ -6602,34 +6602,59 @@
               <a:graphicData uri="http://schemas.openxmlformats.org/drawingml/2006/picture">
                 <pic:pic xmlns:pic="http://schemas.openxmlformats.org/drawingml/2006/picture">
                   <pic:nvPicPr>
-                    <pic:cNvPr id="472660078" name="Picture 5" descr="A graph of a diagram&#10;&#10;AI-generated content may be incorrect."/>
+                    <pic:cNvPr id="1836487775" name="Picture 21" descr="A screenshot of a graph&#10;&#10;AI-generated content may be incorrect."/>
                     <pic:cNvPicPr/>
                   </pic:nvPicPr>
-                  <pic:blipFill>
-                    <a:blip r:embed="rId22" cstate="print">
+                  <pic:blipFill rotWithShape="1">
+                    <a:blip r:embed="rId22">
                       <a:extLst>
                         <a:ext uri="{28A0092B-C50C-407E-A947-70E740481C1C}">
                           <a14:useLocalDpi xmlns:a14="http://schemas.microsoft.com/office/drawing/2010/main" val="0"/>
                         </a:ext>
                       </a:extLst>
                     </a:blip>
+                    <a:srcRect t="949"/>
                     <a:stretch>
                       <a:fillRect/>
                     </a:stretch>
                   </pic:blipFill>
-                  <pic:spPr>
+                  <pic:spPr bwMode="auto">
                     <a:xfrm>
                       <a:off x="0" y="0"/>
-                      <a:ext cx="5734800" cy="4093654"/>
+                      <a:ext cx="5731510" cy="4043680"/>
                     </a:xfrm>
                     <a:prstGeom prst="rect">
                       <a:avLst/>
                     </a:prstGeom>
-                    <a:ln>
+                    <a:ln w="9525" cap="flat" cmpd="sng" algn="ctr">
                       <a:solidFill>
-                        <a:schemeClr val="tx1"/>
+                        <a:sysClr val="windowText" lastClr="000000"/>
                       </a:solidFill>
+                      <a:prstDash val="solid"/>
+                      <a:round/>
+                      <a:headEnd type="none" w="med" len="med"/>
+                      <a:tailEnd type="none" w="med" len="med"/>
+                      <a:extLst>
+                        <a:ext uri="{C807C97D-BFC1-408E-A445-0C87EB9F89A2}">
+                          <ask:lineSketchStyleProps xmlns:ask="http://schemas.microsoft.com/office/drawing/2018/sketchyshapes" sd="0">
+                            <a:custGeom>
+                              <a:avLst/>
+                              <a:gdLst/>
+                              <a:ahLst/>
+                              <a:cxnLst/>
+                              <a:rect l="0" t="0" r="0" b="0"/>
+                              <a:pathLst/>
+                            </a:custGeom>
+                            <ask:type/>
+                          </ask:lineSketchStyleProps>
+                        </a:ext>
+                      </a:extLst>
                     </a:ln>
+                    <a:extLst>
+                      <a:ext uri="{53640926-AAD7-44D8-BBD7-CCE9431645EC}">
+                        <a14:shadowObscured xmlns:a14="http://schemas.microsoft.com/office/drawing/2010/main"/>
+                      </a:ext>
+                    </a:extLst>
                   </pic:spPr>
                 </pic:pic>
               </a:graphicData>
@@ -6703,37 +6728,19 @@
         <w:t xml:space="preserve">was essentially not accurate. With an accuracy of </w:t>
       </w:r>
       <w:r>
-        <w:t>48</w:t>
-      </w:r>
-      <w:r>
-        <w:t>.</w:t>
-      </w:r>
-      <w:r>
-        <w:t>4</w:t>
+        <w:t>27</w:t>
       </w:r>
       <w:r>
         <w:t>% and a Kappa statistic of 0.</w:t>
       </w:r>
       <w:r>
-        <w:t>349</w:t>
+        <w:t>02</w:t>
       </w:r>
       <w:r>
         <w:t xml:space="preserve"> this model was not</w:t>
       </w:r>
       <w:r>
-        <w:t xml:space="preserve"> good enough to predict storage week based on physiochemical profile. The week </w:t>
-      </w:r>
-      <w:r>
-        <w:t xml:space="preserve">correctly predicted week 0 samples — this could be due to the </w:t>
-      </w:r>
-      <w:r>
-        <w:t>imbalanced</w:t>
-      </w:r>
-      <w:r>
-        <w:t xml:space="preserve"> nature of the groups, since there is more week 0 data in each fold</w:t>
-      </w:r>
-      <w:r>
-        <w:t xml:space="preserve">. </w:t>
+        <w:t xml:space="preserve"> good enough to predict storage week based on physiochemical profile. </w:t>
       </w:r>
     </w:p>
     <w:p>
@@ -6748,6 +6755,17 @@
       </w:r>
       <w:r>
         <w:t xml:space="preserve">could not make use of the timeseries nature of the factors. </w:t>
+      </w:r>
+    </w:p>
+    <w:p>
+      <w:pPr>
+        <w:pStyle w:val="Heading3"/>
+      </w:pPr>
+      <w:r>
+        <w:t>The model was trained on week 0 data, but since there was no week 0 data in the test</w:t>
+      </w:r>
+      <w:r>
+        <w:t xml:space="preserve"> set it – perhaps by chance – did not predict any samples as coming from this condition. </w:t>
       </w:r>
     </w:p>
     <w:p>
@@ -6917,7 +6935,13 @@
               </w:numPr>
             </w:pPr>
             <w:r>
-              <w:t>0.242</w:t>
+              <w:t>0.2</w:t>
+            </w:r>
+            <w:r>
+              <w:t>5</w:t>
+            </w:r>
+            <w:r>
+              <w:t>0</w:t>
             </w:r>
           </w:p>
         </w:tc>
@@ -6935,7 +6959,7 @@
               <w:cnfStyle w:val="000000000000" w:firstRow="0" w:lastRow="0" w:firstColumn="0" w:lastColumn="0" w:oddVBand="0" w:evenVBand="0" w:oddHBand="0" w:evenHBand="0" w:firstRowFirstColumn="0" w:firstRowLastColumn="0" w:lastRowFirstColumn="0" w:lastRowLastColumn="0"/>
             </w:pPr>
             <w:r>
-              <w:t>0.0678</w:t>
+              <w:t>0</w:t>
             </w:r>
           </w:p>
         </w:tc>
@@ -6967,10 +6991,10 @@
           <w14:ligatures w14:val="standardContextual"/>
         </w:rPr>
         <w:drawing>
-          <wp:inline distT="0" distB="0" distL="0" distR="0" wp14:anchorId="07822CDF" wp14:editId="7CF0C9CA">
-            <wp:extent cx="5734800" cy="4041769"/>
-            <wp:effectExtent l="12700" t="12700" r="5715" b="10160"/>
-            <wp:docPr id="1108708245" name="Picture 6" descr="A graph of a number of blue squares&#10;&#10;AI-generated content may be incorrect."/>
+          <wp:inline distT="0" distB="0" distL="0" distR="0" wp14:anchorId="3FADE79B" wp14:editId="66FB9E59">
+            <wp:extent cx="5731510" cy="4048125"/>
+            <wp:effectExtent l="12700" t="12700" r="8890" b="15875"/>
+            <wp:docPr id="1393958950" name="Picture 22" descr="A graph of a chart&#10;&#10;AI-generated content may be incorrect."/>
             <wp:cNvGraphicFramePr>
               <a:graphicFrameLocks xmlns:a="http://schemas.openxmlformats.org/drawingml/2006/main" noChangeAspect="1"/>
             </wp:cNvGraphicFramePr>
@@ -6978,18 +7002,18 @@
               <a:graphicData uri="http://schemas.openxmlformats.org/drawingml/2006/picture">
                 <pic:pic xmlns:pic="http://schemas.openxmlformats.org/drawingml/2006/picture">
                   <pic:nvPicPr>
-                    <pic:cNvPr id="1108708245" name="Picture 6" descr="A graph of a number of blue squares&#10;&#10;AI-generated content may be incorrect."/>
+                    <pic:cNvPr id="1393958950" name="Picture 22" descr="A graph of a chart&#10;&#10;AI-generated content may be incorrect."/>
                     <pic:cNvPicPr/>
                   </pic:nvPicPr>
                   <pic:blipFill rotWithShape="1">
-                    <a:blip r:embed="rId23" cstate="print">
+                    <a:blip r:embed="rId23">
                       <a:extLst>
                         <a:ext uri="{28A0092B-C50C-407E-A947-70E740481C1C}">
                           <a14:useLocalDpi xmlns:a14="http://schemas.microsoft.com/office/drawing/2010/main" val="0"/>
                         </a:ext>
                       </a:extLst>
                     </a:blip>
-                    <a:srcRect l="707" t="708" b="982"/>
+                    <a:srcRect t="840"/>
                     <a:stretch>
                       <a:fillRect/>
                     </a:stretch>
@@ -6997,7 +7021,7 @@
                   <pic:spPr bwMode="auto">
                     <a:xfrm>
                       <a:off x="0" y="0"/>
-                      <a:ext cx="5734800" cy="4041769"/>
+                      <a:ext cx="5731510" cy="4048125"/>
                     </a:xfrm>
                     <a:prstGeom prst="rect">
                       <a:avLst/>
@@ -7102,10 +7126,16 @@
         <w:fldChar w:fldCharType="end"/>
       </w:r>
       <w:r>
-        <w:t>), with an accuracy of 24% and Kappa statistic of</w:t>
-      </w:r>
-      <w:r>
-        <w:t xml:space="preserve"> 0.06. This model i</w:t>
+        <w:t>), with an accuracy of 2</w:t>
+      </w:r>
+      <w:r>
+        <w:t>5</w:t>
+      </w:r>
+      <w:r>
+        <w:t>% and Kappa statistic of</w:t>
+      </w:r>
+      <w:r>
+        <w:t xml:space="preserve"> 0. This model i</w:t>
       </w:r>
       <w:r>
         <w:t>s effectively worse than random. The model predicts most samples</w:t>
@@ -7114,14 +7144,20 @@
         <w:t xml:space="preserve"> belong to week 11. This is possibly </w:t>
       </w:r>
       <w:r>
-        <w:t xml:space="preserve">an averaging effect, take the overall mean values of the weeks and the median value is likely to exist in week 11. </w:t>
-      </w:r>
-      <w:r>
-        <w:t xml:space="preserve">The inability to split data temporally is limiting these models, since each </w:t>
+        <w:t>an averaging effect, take the overall mean values of the week</w:t>
+      </w:r>
+      <w:r>
+        <w:t>s</w:t>
+      </w:r>
+      <w:r>
+        <w:t xml:space="preserve">. </w:t>
+      </w:r>
+      <w:r>
+        <w:t xml:space="preserve">The inability to split data </w:t>
       </w:r>
       <w:r>
         <w:lastRenderedPageBreak/>
-        <w:t xml:space="preserve">week is being treated as an independent group, </w:t>
+        <w:t xml:space="preserve">temporally is limiting these models, since each week is being treated as an independent group, </w:t>
       </w:r>
       <w:r>
         <w:t>rather</w:t>
@@ -7129,13 +7165,29 @@
       <w:r>
         <w:t xml:space="preserve"> </w:t>
       </w:r>
-      <w:proofErr w:type="spellStart"/>
-      <w:r>
-        <w:t>that</w:t>
-      </w:r>
-      <w:proofErr w:type="spellEnd"/>
-      <w:r>
-        <w:t xml:space="preserve"> week 0 existing prior to week 5 and week 11 </w:t>
+      <w:r>
+        <w:t>than</w:t>
+      </w:r>
+      <w:r>
+        <w:t xml:space="preserve"> week </w:t>
+      </w:r>
+      <w:r>
+        <w:t>5</w:t>
+      </w:r>
+      <w:r>
+        <w:t xml:space="preserve"> existing prior to week </w:t>
+      </w:r>
+      <w:r>
+        <w:t>11</w:t>
+      </w:r>
+      <w:r>
+        <w:t xml:space="preserve"> and week 1</w:t>
+      </w:r>
+      <w:r>
+        <w:t>7</w:t>
+      </w:r>
+      <w:r>
+        <w:t xml:space="preserve"> </w:t>
       </w:r>
       <w:proofErr w:type="spellStart"/>
       <w:r>
@@ -7350,7 +7402,7 @@
                 <w:szCs w:val="26"/>
                 <w:lang w:eastAsia="en-US"/>
               </w:rPr>
-              <w:t>410</w:t>
+              <w:t>233</w:t>
             </w:r>
           </w:p>
         </w:tc>
@@ -7393,31 +7445,7 @@
                 <w:szCs w:val="26"/>
                 <w:lang w:eastAsia="en-US"/>
               </w:rPr>
-              <w:t>0</w:t>
-            </w:r>
-            <w:r>
-              <w:rPr>
-                <w:rFonts w:ascii="Calibri" w:hAnsi="Calibri" w:cs="Arial"/>
-                <w:bCs/>
-                <w:iCs/>
-                <w:kern w:val="32"/>
-                <w:sz w:val="22"/>
-                <w:szCs w:val="26"/>
-                <w:lang w:eastAsia="en-US"/>
-              </w:rPr>
-              <w:t>5</w:t>
-            </w:r>
-            <w:r>
-              <w:rPr>
-                <w:rFonts w:ascii="Calibri" w:hAnsi="Calibri" w:cs="Arial"/>
-                <w:bCs/>
-                <w:iCs/>
-                <w:kern w:val="32"/>
-                <w:sz w:val="22"/>
-                <w:szCs w:val="26"/>
-                <w:lang w:eastAsia="en-US"/>
-              </w:rPr>
-              <w:t>3</w:t>
+              <w:t>008</w:t>
             </w:r>
           </w:p>
         </w:tc>
@@ -7434,10 +7462,10 @@
           <w14:ligatures w14:val="standardContextual"/>
         </w:rPr>
         <w:drawing>
-          <wp:inline distT="0" distB="0" distL="0" distR="0" wp14:anchorId="0FBB22B2" wp14:editId="6E865468">
+          <wp:inline distT="0" distB="0" distL="0" distR="0" wp14:anchorId="2A4AB5C4" wp14:editId="12D9AB62">
             <wp:extent cx="5731510" cy="4082415"/>
-            <wp:effectExtent l="0" t="0" r="0" b="0"/>
-            <wp:docPr id="2033507646" name="Picture 10" descr="A blue squares with black numbers&#10;&#10;AI-generated content may be incorrect."/>
+            <wp:effectExtent l="12700" t="12700" r="8890" b="6985"/>
+            <wp:docPr id="146284135" name="Picture 23" descr="A blue and white chart&#10;&#10;AI-generated content may be incorrect."/>
             <wp:cNvGraphicFramePr>
               <a:graphicFrameLocks xmlns:a="http://schemas.openxmlformats.org/drawingml/2006/main" noChangeAspect="1"/>
             </wp:cNvGraphicFramePr>
@@ -7445,382 +7473,11 @@
               <a:graphicData uri="http://schemas.openxmlformats.org/drawingml/2006/picture">
                 <pic:pic xmlns:pic="http://schemas.openxmlformats.org/drawingml/2006/picture">
                   <pic:nvPicPr>
-                    <pic:cNvPr id="2033507646" name="Picture 10" descr="A blue squares with black numbers&#10;&#10;AI-generated content may be incorrect."/>
+                    <pic:cNvPr id="146284135" name="Picture 23" descr="A blue and white chart&#10;&#10;AI-generated content may be incorrect."/>
                     <pic:cNvPicPr/>
                   </pic:nvPicPr>
                   <pic:blipFill>
-                    <a:blip r:embed="rId24" cstate="print">
-                      <a:extLst>
-                        <a:ext uri="{28A0092B-C50C-407E-A947-70E740481C1C}">
-                          <a14:useLocalDpi xmlns:a14="http://schemas.microsoft.com/office/drawing/2010/main" val="0"/>
-                        </a:ext>
-                      </a:extLst>
-                    </a:blip>
-                    <a:stretch>
-                      <a:fillRect/>
-                    </a:stretch>
-                  </pic:blipFill>
-                  <pic:spPr>
-                    <a:xfrm>
-                      <a:off x="0" y="0"/>
-                      <a:ext cx="5731510" cy="4082415"/>
-                    </a:xfrm>
-                    <a:prstGeom prst="rect">
-                      <a:avLst/>
-                    </a:prstGeom>
-                  </pic:spPr>
-                </pic:pic>
-              </a:graphicData>
-            </a:graphic>
-          </wp:inline>
-        </w:drawing>
-      </w:r>
-    </w:p>
-    <w:p>
-      <w:pPr>
-        <w:pStyle w:val="Caption"/>
-      </w:pPr>
-      <w:r>
-        <w:t xml:space="preserve">Figure </w:t>
-      </w:r>
-      <w:r>
-        <w:fldChar w:fldCharType="begin"/>
-      </w:r>
-      <w:r>
-        <w:instrText xml:space="preserve"> SEQ Figure \* ARABIC </w:instrText>
-      </w:r>
-      <w:r>
-        <w:fldChar w:fldCharType="separate"/>
-      </w:r>
-      <w:r>
-        <w:rPr>
-          <w:noProof/>
-        </w:rPr>
-        <w:t>7</w:t>
-      </w:r>
-      <w:r>
-        <w:fldChar w:fldCharType="end"/>
-      </w:r>
-      <w:r>
-        <w:t>:</w:t>
-      </w:r>
-      <w:r>
-        <w:t xml:space="preserve">Confusion Matrix </w:t>
-      </w:r>
-      <w:r>
-        <w:t xml:space="preserve">for Ripening.Stage </w:t>
-      </w:r>
-      <w:r>
-        <w:t>cv Random Forest model tested on DCA Year 2 data, trained on DCA Year 1 data</w:t>
-      </w:r>
-    </w:p>
-    <w:p>
-      <w:pPr>
-        <w:pStyle w:val="Heading3"/>
-      </w:pPr>
-      <w:r>
-        <w:t>This</w:t>
-      </w:r>
-      <w:r>
-        <w:t xml:space="preserve"> model </w:t>
-      </w:r>
-      <w:r>
-        <w:t xml:space="preserve">also does not accurately predict ripening stage of apples based on their physiochemical properties. The model correctly predicts most apples as early, given the weights of the distribution </w:t>
-      </w:r>
-      <w:r>
-        <w:t xml:space="preserve">of this data </w:t>
-      </w:r>
-      <w:r>
-        <w:fldChar w:fldCharType="begin"/>
-      </w:r>
-      <w:r>
-        <w:instrText xml:space="preserve"> REF _Ref222150089 \h </w:instrText>
-      </w:r>
-      <w:r>
-        <w:fldChar w:fldCharType="separate"/>
-      </w:r>
-      <w:r>
-        <w:t xml:space="preserve">Table </w:t>
-      </w:r>
-      <w:r>
-        <w:rPr>
-          <w:noProof/>
-        </w:rPr>
-        <w:t>3</w:t>
-      </w:r>
-      <w:r>
-        <w:fldChar w:fldCharType="end"/>
-      </w:r>
-      <w:r>
-        <w:t xml:space="preserve">, 45% of the </w:t>
-      </w:r>
-      <w:r>
-        <w:t xml:space="preserve">training data is classified as early. </w:t>
-      </w:r>
-      <w:r>
-        <w:t xml:space="preserve">This model likely just reflects the </w:t>
-      </w:r>
-      <w:r>
-        <w:t>imbalance</w:t>
-      </w:r>
-      <w:r>
-        <w:t xml:space="preserve">. </w:t>
-      </w:r>
-    </w:p>
-    <w:p>
-      <w:pPr>
-        <w:pStyle w:val="Heading3"/>
-      </w:pPr>
-      <w:r>
-        <w:rPr>
-          <w:b/>
-          <w:bCs w:val="0"/>
-        </w:rPr>
-        <w:t xml:space="preserve">Repeat the process above, but this time use Year2 to train and optimise the model and Year1 as test set: </w:t>
-      </w:r>
-      <w:r>
-        <w:t xml:space="preserve">The pipeline was </w:t>
-      </w:r>
-      <w:r>
-        <w:t>repeated, but using DCA Year 2 to train the model and DCA Year 1 to test the model.</w:t>
-      </w:r>
-    </w:p>
-    <w:p>
-      <w:pPr>
-        <w:pStyle w:val="Caption"/>
-      </w:pPr>
-      <w:r>
-        <w:lastRenderedPageBreak/>
-        <w:t xml:space="preserve">Table </w:t>
-      </w:r>
-      <w:r>
-        <w:fldChar w:fldCharType="begin"/>
-      </w:r>
-      <w:r>
-        <w:instrText xml:space="preserve"> SEQ Table \* ARABIC </w:instrText>
-      </w:r>
-      <w:r>
-        <w:fldChar w:fldCharType="separate"/>
-      </w:r>
-      <w:r>
-        <w:rPr>
-          <w:noProof/>
-        </w:rPr>
-        <w:t>7</w:t>
-      </w:r>
-      <w:r>
-        <w:fldChar w:fldCharType="end"/>
-      </w:r>
-      <w:r>
-        <w:t>: Basic Statistics for Ripening</w:t>
-      </w:r>
-      <w:r>
-        <w:t>.</w:t>
-      </w:r>
-      <w:r>
-        <w:t xml:space="preserve">Stage cv Random Forest model Trn: DCA Y2 </w:t>
-      </w:r>
-      <w:proofErr w:type="spellStart"/>
-      <w:r>
-        <w:t>Tst</w:t>
-      </w:r>
-      <w:proofErr w:type="spellEnd"/>
-      <w:r>
-        <w:t>: DCA Y1</w:t>
-      </w:r>
-    </w:p>
-    <w:tbl>
-      <w:tblPr>
-        <w:tblStyle w:val="IlluminaOrange"/>
-        <w:tblW w:w="9016" w:type="dxa"/>
-        <w:tblLook w:val="04A0" w:firstRow="1" w:lastRow="0" w:firstColumn="1" w:lastColumn="0" w:noHBand="0" w:noVBand="1"/>
-      </w:tblPr>
-      <w:tblGrid>
-        <w:gridCol w:w="4508"/>
-        <w:gridCol w:w="4508"/>
-      </w:tblGrid>
-      <w:tr>
-        <w:trPr>
-          <w:cnfStyle w:val="100000000000" w:firstRow="1" w:lastRow="0" w:firstColumn="0" w:lastColumn="0" w:oddVBand="0" w:evenVBand="0" w:oddHBand="0" w:evenHBand="0" w:firstRowFirstColumn="0" w:firstRowLastColumn="0" w:lastRowFirstColumn="0" w:lastRowLastColumn="0"/>
-        </w:trPr>
-        <w:tc>
-          <w:tcPr>
-            <w:cnfStyle w:val="001000000000" w:firstRow="0" w:lastRow="0" w:firstColumn="1" w:lastColumn="0" w:oddVBand="0" w:evenVBand="0" w:oddHBand="0" w:evenHBand="0" w:firstRowFirstColumn="0" w:firstRowLastColumn="0" w:lastRowFirstColumn="0" w:lastRowLastColumn="0"/>
-            <w:tcW w:w="4508" w:type="dxa"/>
-          </w:tcPr>
-          <w:p>
-            <w:pPr>
-              <w:rPr>
-                <w:rFonts w:ascii="Calibri" w:hAnsi="Calibri" w:cs="Arial"/>
-                <w:iCs/>
-                <w:color w:val="7F7F7F" w:themeColor="text1" w:themeTint="80"/>
-                <w:kern w:val="32"/>
-                <w:sz w:val="22"/>
-                <w:szCs w:val="26"/>
-                <w:lang w:eastAsia="en-US"/>
-              </w:rPr>
-            </w:pPr>
-            <w:r>
-              <w:rPr>
-                <w:rFonts w:ascii="Calibri" w:hAnsi="Calibri" w:cs="Arial"/>
-                <w:iCs/>
-                <w:color w:val="7F7F7F" w:themeColor="text1" w:themeTint="80"/>
-                <w:kern w:val="32"/>
-                <w:sz w:val="22"/>
-                <w:szCs w:val="26"/>
-                <w:lang w:eastAsia="en-US"/>
-              </w:rPr>
-              <w:t>Accuracy</w:t>
-            </w:r>
-          </w:p>
-        </w:tc>
-        <w:tc>
-          <w:tcPr>
-            <w:tcW w:w="4508" w:type="dxa"/>
-          </w:tcPr>
-          <w:p>
-            <w:pPr>
-              <w:cnfStyle w:val="100000000000" w:firstRow="1" w:lastRow="0" w:firstColumn="0" w:lastColumn="0" w:oddVBand="0" w:evenVBand="0" w:oddHBand="0" w:evenHBand="0" w:firstRowFirstColumn="0" w:firstRowLastColumn="0" w:lastRowFirstColumn="0" w:lastRowLastColumn="0"/>
-              <w:rPr>
-                <w:rFonts w:ascii="Calibri" w:hAnsi="Calibri" w:cs="Arial"/>
-                <w:iCs/>
-                <w:color w:val="7F7F7F" w:themeColor="text1" w:themeTint="80"/>
-                <w:kern w:val="32"/>
-                <w:sz w:val="22"/>
-                <w:szCs w:val="26"/>
-                <w:lang w:eastAsia="en-US"/>
-              </w:rPr>
-            </w:pPr>
-            <w:r>
-              <w:rPr>
-                <w:rFonts w:ascii="Calibri" w:hAnsi="Calibri" w:cs="Arial"/>
-                <w:iCs/>
-                <w:color w:val="7F7F7F" w:themeColor="text1" w:themeTint="80"/>
-                <w:kern w:val="32"/>
-                <w:sz w:val="22"/>
-                <w:szCs w:val="26"/>
-                <w:lang w:eastAsia="en-US"/>
-              </w:rPr>
-              <w:t>Kappa</w:t>
-            </w:r>
-          </w:p>
-        </w:tc>
-      </w:tr>
-      <w:tr>
-        <w:tc>
-          <w:tcPr>
-            <w:cnfStyle w:val="001000000000" w:firstRow="0" w:lastRow="0" w:firstColumn="1" w:lastColumn="0" w:oddVBand="0" w:evenVBand="0" w:oddHBand="0" w:evenHBand="0" w:firstRowFirstColumn="0" w:firstRowLastColumn="0" w:lastRowFirstColumn="0" w:lastRowLastColumn="0"/>
-            <w:tcW w:w="4508" w:type="dxa"/>
-          </w:tcPr>
-          <w:p>
-            <w:pPr>
-              <w:rPr>
-                <w:rFonts w:ascii="Calibri" w:hAnsi="Calibri" w:cs="Arial"/>
-                <w:bCs/>
-                <w:iCs/>
-                <w:kern w:val="32"/>
-                <w:sz w:val="22"/>
-                <w:szCs w:val="26"/>
-                <w:lang w:eastAsia="en-US"/>
-              </w:rPr>
-            </w:pPr>
-            <w:r>
-              <w:rPr>
-                <w:rFonts w:ascii="Calibri" w:hAnsi="Calibri" w:cs="Arial"/>
-                <w:bCs/>
-                <w:iCs/>
-                <w:kern w:val="32"/>
-                <w:sz w:val="22"/>
-                <w:szCs w:val="26"/>
-                <w:lang w:eastAsia="en-US"/>
-              </w:rPr>
-              <w:t>0.</w:t>
-            </w:r>
-            <w:r>
-              <w:rPr>
-                <w:rFonts w:ascii="Calibri" w:hAnsi="Calibri" w:cs="Arial"/>
-                <w:bCs/>
-                <w:iCs/>
-                <w:kern w:val="32"/>
-                <w:sz w:val="22"/>
-                <w:szCs w:val="26"/>
-                <w:lang w:eastAsia="en-US"/>
-              </w:rPr>
-              <w:t>363</w:t>
-            </w:r>
-          </w:p>
-        </w:tc>
-        <w:tc>
-          <w:tcPr>
-            <w:tcW w:w="4508" w:type="dxa"/>
-          </w:tcPr>
-          <w:p>
-            <w:pPr>
-              <w:cnfStyle w:val="000000000000" w:firstRow="0" w:lastRow="0" w:firstColumn="0" w:lastColumn="0" w:oddVBand="0" w:evenVBand="0" w:oddHBand="0" w:evenHBand="0" w:firstRowFirstColumn="0" w:firstRowLastColumn="0" w:lastRowFirstColumn="0" w:lastRowLastColumn="0"/>
-              <w:rPr>
-                <w:rFonts w:ascii="Calibri" w:hAnsi="Calibri" w:cs="Arial"/>
-                <w:bCs/>
-                <w:iCs/>
-                <w:kern w:val="32"/>
-                <w:sz w:val="22"/>
-                <w:szCs w:val="26"/>
-                <w:lang w:eastAsia="en-US"/>
-              </w:rPr>
-            </w:pPr>
-            <w:r>
-              <w:rPr>
-                <w:rFonts w:ascii="Calibri" w:hAnsi="Calibri" w:cs="Arial"/>
-                <w:bCs/>
-                <w:iCs/>
-                <w:kern w:val="32"/>
-                <w:sz w:val="22"/>
-                <w:szCs w:val="26"/>
-                <w:lang w:eastAsia="en-US"/>
-              </w:rPr>
-              <w:t>0.</w:t>
-            </w:r>
-            <w:r>
-              <w:rPr>
-                <w:rFonts w:ascii="Calibri" w:hAnsi="Calibri" w:cs="Arial"/>
-                <w:bCs/>
-                <w:iCs/>
-                <w:kern w:val="32"/>
-                <w:sz w:val="22"/>
-                <w:szCs w:val="26"/>
-                <w:lang w:eastAsia="en-US"/>
-              </w:rPr>
-              <w:t>004</w:t>
-            </w:r>
-          </w:p>
-        </w:tc>
-      </w:tr>
-    </w:tbl>
-    <w:p/>
-    <w:p>
-      <w:pPr>
-        <w:keepNext/>
-      </w:pPr>
-      <w:r>
-        <w:rPr>
-          <w:noProof/>
-        </w:rPr>
-        <w:drawing>
-          <wp:inline distT="0" distB="0" distL="0" distR="0" wp14:anchorId="64BF18D3" wp14:editId="3E78057D">
-            <wp:extent cx="5731510" cy="4082415"/>
-            <wp:effectExtent l="12700" t="12700" r="8890" b="6985"/>
-            <wp:docPr id="1147121522" name="Picture 11" descr="A graph of a graph&#10;&#10;AI-generated content may be incorrect."/>
-            <wp:cNvGraphicFramePr>
-              <a:graphicFrameLocks xmlns:a="http://schemas.openxmlformats.org/drawingml/2006/main" noChangeAspect="1"/>
-            </wp:cNvGraphicFramePr>
-            <a:graphic xmlns:a="http://schemas.openxmlformats.org/drawingml/2006/main">
-              <a:graphicData uri="http://schemas.openxmlformats.org/drawingml/2006/picture">
-                <pic:pic xmlns:pic="http://schemas.openxmlformats.org/drawingml/2006/picture">
-                  <pic:nvPicPr>
-                    <pic:cNvPr id="1147121522" name="Picture 11" descr="A graph of a graph&#10;&#10;AI-generated content may be incorrect."/>
-                    <pic:cNvPicPr/>
-                  </pic:nvPicPr>
-                  <pic:blipFill>
-                    <a:blip r:embed="rId25" cstate="print">
+                    <a:blip r:embed="rId24">
                       <a:extLst>
                         <a:ext uri="{28A0092B-C50C-407E-A947-70E740481C1C}">
                           <a14:useLocalDpi xmlns:a14="http://schemas.microsoft.com/office/drawing/2010/main" val="0"/>
@@ -7872,13 +7529,13 @@
         <w:rPr>
           <w:noProof/>
         </w:rPr>
-        <w:t>8</w:t>
+        <w:t>7</w:t>
       </w:r>
       <w:r>
         <w:fldChar w:fldCharType="end"/>
       </w:r>
       <w:r>
-        <w:t xml:space="preserve">: </w:t>
+        <w:t>:</w:t>
       </w:r>
       <w:r>
         <w:t xml:space="preserve">Confusion Matrix </w:t>
@@ -7892,17 +7549,430 @@
     </w:p>
     <w:p>
       <w:pPr>
-        <w:rPr>
-          <w:lang w:val="en-US" w:eastAsia="en-US"/>
-        </w:rPr>
-      </w:pPr>
+        <w:pStyle w:val="Heading3"/>
+      </w:pPr>
+      <w:r>
+        <w:t>This</w:t>
+      </w:r>
+      <w:r>
+        <w:t xml:space="preserve"> model </w:t>
+      </w:r>
+      <w:r>
+        <w:t xml:space="preserve">also does not accurately predict ripening stage of apples based on their physiochemical properties. The model correctly predicts most apples as early, given the weights of the distribution </w:t>
+      </w:r>
+      <w:r>
+        <w:t xml:space="preserve">of this data </w:t>
+      </w:r>
+      <w:r>
+        <w:fldChar w:fldCharType="begin"/>
+      </w:r>
+      <w:r>
+        <w:instrText xml:space="preserve"> REF _Ref222150089 \h </w:instrText>
+      </w:r>
+      <w:r>
+        <w:fldChar w:fldCharType="separate"/>
+      </w:r>
+      <w:r>
+        <w:t xml:space="preserve">Table </w:t>
+      </w:r>
+      <w:r>
+        <w:rPr>
+          <w:noProof/>
+        </w:rPr>
+        <w:t>3</w:t>
+      </w:r>
+      <w:r>
+        <w:fldChar w:fldCharType="end"/>
+      </w:r>
+      <w:r>
+        <w:t xml:space="preserve">, 45% of the </w:t>
+      </w:r>
+      <w:r>
+        <w:t xml:space="preserve">training data is classified as early. </w:t>
+      </w:r>
+      <w:r>
+        <w:t xml:space="preserve">This model likely just reflects the </w:t>
+      </w:r>
+      <w:r>
+        <w:t>imbalance</w:t>
+      </w:r>
+      <w:r>
+        <w:t xml:space="preserve">. </w:t>
+      </w:r>
     </w:p>
     <w:p>
       <w:pPr>
         <w:pStyle w:val="Heading3"/>
       </w:pPr>
       <w:r>
-        <w:t xml:space="preserve">As with the storage week model, I have likely just made a model that </w:t>
+        <w:rPr>
+          <w:b/>
+          <w:bCs w:val="0"/>
+        </w:rPr>
+        <w:t xml:space="preserve">Repeat the process above, but this time use Year2 to train and optimise the model and Year1 as test set: </w:t>
+      </w:r>
+      <w:r>
+        <w:t xml:space="preserve">The pipeline was </w:t>
+      </w:r>
+      <w:r>
+        <w:t>repeated, but using DCA Year 2 to train the model and DCA Year 1 to test the model.</w:t>
+      </w:r>
+    </w:p>
+    <w:p>
+      <w:pPr>
+        <w:pStyle w:val="Caption"/>
+      </w:pPr>
+      <w:r>
+        <w:lastRenderedPageBreak/>
+        <w:t xml:space="preserve">Table </w:t>
+      </w:r>
+      <w:r>
+        <w:fldChar w:fldCharType="begin"/>
+      </w:r>
+      <w:r>
+        <w:instrText xml:space="preserve"> SEQ Table \* ARABIC </w:instrText>
+      </w:r>
+      <w:r>
+        <w:fldChar w:fldCharType="separate"/>
+      </w:r>
+      <w:r>
+        <w:rPr>
+          <w:noProof/>
+        </w:rPr>
+        <w:t>7</w:t>
+      </w:r>
+      <w:r>
+        <w:fldChar w:fldCharType="end"/>
+      </w:r>
+      <w:r>
+        <w:t>: Basic Statistics for Ripening</w:t>
+      </w:r>
+      <w:r>
+        <w:t>.</w:t>
+      </w:r>
+      <w:r>
+        <w:t xml:space="preserve">Stage cv Random Forest model Trn: DCA Y2 </w:t>
+      </w:r>
+      <w:proofErr w:type="spellStart"/>
+      <w:r>
+        <w:t>Tst</w:t>
+      </w:r>
+      <w:proofErr w:type="spellEnd"/>
+      <w:r>
+        <w:t>: DCA Y1</w:t>
+      </w:r>
+    </w:p>
+    <w:tbl>
+      <w:tblPr>
+        <w:tblStyle w:val="IlluminaOrange"/>
+        <w:tblW w:w="9016" w:type="dxa"/>
+        <w:tblLook w:val="04A0" w:firstRow="1" w:lastRow="0" w:firstColumn="1" w:lastColumn="0" w:noHBand="0" w:noVBand="1"/>
+      </w:tblPr>
+      <w:tblGrid>
+        <w:gridCol w:w="4508"/>
+        <w:gridCol w:w="4508"/>
+      </w:tblGrid>
+      <w:tr>
+        <w:trPr>
+          <w:cnfStyle w:val="100000000000" w:firstRow="1" w:lastRow="0" w:firstColumn="0" w:lastColumn="0" w:oddVBand="0" w:evenVBand="0" w:oddHBand="0" w:evenHBand="0" w:firstRowFirstColumn="0" w:firstRowLastColumn="0" w:lastRowFirstColumn="0" w:lastRowLastColumn="0"/>
+        </w:trPr>
+        <w:tc>
+          <w:tcPr>
+            <w:cnfStyle w:val="001000000000" w:firstRow="0" w:lastRow="0" w:firstColumn="1" w:lastColumn="0" w:oddVBand="0" w:evenVBand="0" w:oddHBand="0" w:evenHBand="0" w:firstRowFirstColumn="0" w:firstRowLastColumn="0" w:lastRowFirstColumn="0" w:lastRowLastColumn="0"/>
+            <w:tcW w:w="4508" w:type="dxa"/>
+          </w:tcPr>
+          <w:p>
+            <w:pPr>
+              <w:rPr>
+                <w:rFonts w:ascii="Calibri" w:hAnsi="Calibri" w:cs="Arial"/>
+                <w:iCs/>
+                <w:color w:val="7F7F7F" w:themeColor="text1" w:themeTint="80"/>
+                <w:kern w:val="32"/>
+                <w:sz w:val="22"/>
+                <w:szCs w:val="26"/>
+                <w:lang w:eastAsia="en-US"/>
+              </w:rPr>
+            </w:pPr>
+            <w:r>
+              <w:rPr>
+                <w:rFonts w:ascii="Calibri" w:hAnsi="Calibri" w:cs="Arial"/>
+                <w:iCs/>
+                <w:color w:val="7F7F7F" w:themeColor="text1" w:themeTint="80"/>
+                <w:kern w:val="32"/>
+                <w:sz w:val="22"/>
+                <w:szCs w:val="26"/>
+                <w:lang w:eastAsia="en-US"/>
+              </w:rPr>
+              <w:t>Accuracy</w:t>
+            </w:r>
+          </w:p>
+        </w:tc>
+        <w:tc>
+          <w:tcPr>
+            <w:tcW w:w="4508" w:type="dxa"/>
+          </w:tcPr>
+          <w:p>
+            <w:pPr>
+              <w:cnfStyle w:val="100000000000" w:firstRow="1" w:lastRow="0" w:firstColumn="0" w:lastColumn="0" w:oddVBand="0" w:evenVBand="0" w:oddHBand="0" w:evenHBand="0" w:firstRowFirstColumn="0" w:firstRowLastColumn="0" w:lastRowFirstColumn="0" w:lastRowLastColumn="0"/>
+              <w:rPr